<commit_message>
feat(meal-pricing): implement meal pricing management module
</commit_message>
<xml_diff>
--- a/docs/05_Business Rules for Smart Meal Planning & Mess Operations Platform.docx
+++ b/docs/05_Business Rules for Smart Meal Planning & Mess Operations Platform.docx
@@ -911,10 +911,10 @@
         <w:t xml:space="preserve">5. Meal </w:t>
       </w:r>
       <w:r>
-        <w:t>Options</w:t>
-      </w:r>
-      <w:r>
-        <w:t xml:space="preserve"> Rules</w:t>
+        <w:t xml:space="preserve">Pricing </w:t>
+      </w:r>
+      <w:r>
+        <w:t>Rules</w:t>
       </w:r>
     </w:p>
     <w:p>
@@ -943,18 +943,7 @@
         <w:pStyle w:val="BodyText"/>
       </w:pPr>
       <w:r>
-        <w:t>The application supports predefined Meal Options (Half Meal and Full Meal). Customers select one Meal Option when they intend to have a meal</w:t>
-      </w:r>
-      <w:r>
-        <w:t>.</w:t>
-      </w:r>
-    </w:p>
-    <w:p>
-      <w:pPr>
-        <w:pStyle w:val="BodyText"/>
-      </w:pPr>
-      <w:r>
-        <w:t>Every Meal Record records the selected Meal Option.</w:t>
+        <w:t>Only the Mess Owner can update Meal Prices.</w:t>
       </w:r>
     </w:p>
     <w:p>
@@ -1010,31 +999,26 @@
         <w:pStyle w:val="BodyText"/>
       </w:pPr>
       <w:r>
+        <w:t>Pricing decisions are solely the responsibility of the Mess Owner.</w:t>
+      </w:r>
+    </w:p>
+    <w:p>
+      <w:pPr>
+        <w:pStyle w:val="BodyText"/>
+      </w:pPr>
+      <w:r>
+        <w:rPr>
+          <w:b/>
+          <w:bCs/>
+        </w:rPr>
+        <w:t>Affected Modules</w:t>
+      </w:r>
+    </w:p>
+    <w:p>
+      <w:r>
         <w:lastRenderedPageBreak/>
-        <w:t>Meal Templates remain consistent while daily menu items change.</w:t>
-      </w:r>
-    </w:p>
-    <w:p>
-      <w:pPr>
-        <w:pStyle w:val="BodyText"/>
-      </w:pPr>
-      <w:r>
-        <w:rPr>
-          <w:b/>
-          <w:bCs/>
-        </w:rPr>
-        <w:t>Affected Modules</w:t>
-      </w:r>
-    </w:p>
-    <w:p>
-      <w:pPr>
-        <w:pStyle w:val="BodyText"/>
-      </w:pPr>
-      <w:r>
-        <w:t>Meal Template Management</w:t>
-      </w:r>
-    </w:p>
-    <w:p>
+        <w:t>Meal Pricing</w:t>
+      </w:r>
       <w:r>
         <w:pict w14:anchorId="2395AA3B">
           <v:rect id="_x0000_i1036" style="width:0;height:1.5pt" o:hralign="center" o:hrstd="t" o:hr="t"/>
@@ -1068,7 +1052,7 @@
         <w:pStyle w:val="BodyText"/>
       </w:pPr>
       <w:r>
-        <w:t>Only the Mess Owner can modify Meal Templates.</w:t>
+        <w:t>Meal Prices are common for all Customers.</w:t>
       </w:r>
     </w:p>
     <w:p>
@@ -1088,7 +1072,7 @@
         <w:pStyle w:val="BodyText"/>
       </w:pPr>
       <w:r>
-        <w:t>Meal offerings are business decisions.</w:t>
+        <w:t>All Customers are charged according to the same pricing policy.</w:t>
       </w:r>
     </w:p>
     <w:p>
@@ -1104,30 +1088,17 @@
       </w:r>
     </w:p>
     <w:p>
-      <w:pPr>
-        <w:pStyle w:val="BodyText"/>
-      </w:pPr>
-      <w:r>
-        <w:t>Meal Template Management</w:t>
-      </w:r>
-    </w:p>
-    <w:p>
+      <w:r>
+        <w:t>Meal Pricing, Billing</w:t>
+      </w:r>
       <w:r>
         <w:pict w14:anchorId="3FB0682F">
           <v:rect id="_x0000_i1037" style="width:0;height:1.5pt" o:hralign="center" o:hrstd="t" o:hr="t"/>
         </w:pict>
       </w:r>
-    </w:p>
-    <w:p>
-      <w:pPr>
-        <w:pStyle w:val="Heading1"/>
-      </w:pPr>
       <w:bookmarkStart w:id="17" w:name="pricing-rules"/>
       <w:bookmarkEnd w:id="14"/>
       <w:bookmarkEnd w:id="16"/>
-      <w:r>
-        <w:t>6. Pricing Rules</w:t>
-      </w:r>
     </w:p>
     <w:p>
       <w:pPr>
@@ -1155,7 +1126,7 @@
         <w:pStyle w:val="BodyText"/>
       </w:pPr>
       <w:r>
-        <w:t>Only the Mess Owner can update meal pricing.</w:t>
+        <w:t>Only predefined Meal Options may have prices.</w:t>
       </w:r>
     </w:p>
     <w:p>
@@ -1175,7 +1146,19 @@
         <w:pStyle w:val="BodyText"/>
       </w:pPr>
       <w:r>
-        <w:t>Pricing is controlled by the business.</w:t>
+        <w:t>The system supports only the following Meal Options:</w:t>
+      </w:r>
+      <w:r>
+        <w:br/>
+        <w:t>• Half Meal</w:t>
+      </w:r>
+      <w:r>
+        <w:br/>
+        <w:t>• Full Meal</w:t>
+      </w:r>
+      <w:r>
+        <w:br/>
+        <w:t>• Extra Roti</w:t>
       </w:r>
     </w:p>
     <w:p>
@@ -1195,7 +1178,7 @@
         <w:pStyle w:val="BodyText"/>
       </w:pPr>
       <w:r>
-        <w:t>Pricing Management</w:t>
+        <w:t>Meal Pricing</w:t>
       </w:r>
     </w:p>
     <w:p>
@@ -1232,7 +1215,7 @@
         <w:pStyle w:val="BodyText"/>
       </w:pPr>
       <w:r>
-        <w:t>Price updates apply only to future Meal Records.</w:t>
+        <w:t>Meal Prices must always be greater than zero.</w:t>
       </w:r>
     </w:p>
     <w:p>
@@ -1252,31 +1235,25 @@
         <w:pStyle w:val="BodyText"/>
       </w:pPr>
       <w:r>
-        <w:t>Historical transactions must remain unchanged.</w:t>
-      </w:r>
-    </w:p>
-    <w:p>
-      <w:pPr>
-        <w:pStyle w:val="BodyText"/>
-      </w:pPr>
-      <w:r>
-        <w:rPr>
-          <w:b/>
-          <w:bCs/>
-        </w:rPr>
-        <w:lastRenderedPageBreak/>
+        <w:t>Invalid pricing must not be accepted.</w:t>
+      </w:r>
+    </w:p>
+    <w:p>
+      <w:pPr>
+        <w:pStyle w:val="BodyText"/>
+      </w:pPr>
+      <w:r>
+        <w:rPr>
+          <w:b/>
+          <w:bCs/>
+        </w:rPr>
         <w:t>Affected Modules</w:t>
       </w:r>
     </w:p>
     <w:p>
-      <w:pPr>
-        <w:pStyle w:val="BodyText"/>
-      </w:pPr>
-      <w:r>
-        <w:t>Pricing, Billing</w:t>
-      </w:r>
-    </w:p>
-    <w:p>
+      <w:r>
+        <w:t>Meal Pricing</w:t>
+      </w:r>
       <w:r>
         <w:pict w14:anchorId="3AFE8504">
           <v:rect id="_x0000_i1039" style="width:0;height:1.5pt" o:hralign="center" o:hrstd="t" o:hr="t"/>
@@ -1290,6 +1267,7 @@
       <w:bookmarkStart w:id="20" w:name="br-013"/>
       <w:bookmarkEnd w:id="19"/>
       <w:r>
+        <w:lastRenderedPageBreak/>
         <w:t>BR-013</w:t>
       </w:r>
     </w:p>
@@ -1310,7 +1288,7 @@
         <w:pStyle w:val="BodyText"/>
       </w:pPr>
       <w:r>
-        <w:t>Every Meal Record stores the price charged at the time of collection.</w:t>
+        <w:t>Price updates affect only future Meal Responses.</w:t>
       </w:r>
     </w:p>
     <w:p>
@@ -1330,7 +1308,7 @@
         <w:pStyle w:val="BodyText"/>
       </w:pPr>
       <w:r>
-        <w:t>Bills must accurately reflect historical pricing.</w:t>
+        <w:t>Historical Meal Records and Bills must preserve the price that was applicable at the time of meal consumption.</w:t>
       </w:r>
     </w:p>
     <w:p>
@@ -1350,7 +1328,8 @@
         <w:pStyle w:val="BodyText"/>
       </w:pPr>
       <w:r>
-        <w:t>Meal Records, Billing</w:t>
+        <w:br/>
+        <w:t>Meal Pricing, Meal Record, Billing</w:t>
       </w:r>
     </w:p>
     <w:p>
@@ -1514,7 +1493,6 @@
         <w:pStyle w:val="BodyText"/>
       </w:pPr>
       <w:r>
-        <w:lastRenderedPageBreak/>
         <w:t>Meal Planning Dashboard</w:t>
       </w:r>
     </w:p>
@@ -1532,6 +1510,7 @@
       <w:bookmarkStart w:id="24" w:name="br-016"/>
       <w:bookmarkEnd w:id="23"/>
       <w:r>
+        <w:lastRenderedPageBreak/>
         <w:t>BR-016</w:t>
       </w:r>
     </w:p>
@@ -1761,7 +1740,6 @@
     </w:p>
     <w:p>
       <w:r>
-        <w:lastRenderedPageBreak/>
         <w:pict w14:anchorId="1D4DBC47">
           <v:rect id="_x0000_i1045" style="width:0;height:1.5pt" o:hralign="center" o:hrstd="t" o:hr="t"/>
         </w:pict>
@@ -1774,6 +1752,7 @@
       <w:bookmarkStart w:id="28" w:name="br-019"/>
       <w:bookmarkEnd w:id="27"/>
       <w:r>
+        <w:lastRenderedPageBreak/>
         <w:t>BR-019</w:t>
       </w:r>
     </w:p>

</xml_diff>